<commit_message>
feat: lead magnet B — PDF checklist 30 jours déployé
- checklist-30-jours-claude-pme.pdf → static/assets/downloads/ (live)
- docx régénéré avec coverImg(780,1100) : couverture non tronquée
- create-checklist.cjs : fix dimensions image couverture A4

Co-Authored-By: Claude Sonnet 4.6 <noreply@anthropic.com>
</commit_message>
<xml_diff>
--- a/docs/lead-magnets/checklist-30-jours-claude-pme.docx
+++ b/docs/lead-magnets/checklist-30-jours-claude-pme.docx
@@ -9,7 +9,7 @@
       <w:r>
         <w:drawing>
           <wp:inline distT="0" distB="0" distL="0" distR="0">
-            <wp:extent cx="7362825" cy="11039475"/>
+            <wp:extent cx="7429500" cy="10477500"/>
             <wp:effectExtent t="0" r="0" b="0" l="0"/>
             <wp:docPr id="1" name="Cover" descr="Cover" title="Checklist 30 Jours — L'Agence Sauvage"/>
             <wp:cNvGraphicFramePr>
@@ -34,7 +34,7 @@
                   <pic:spPr bwMode="auto">
                     <a:xfrm>
                       <a:off x="0" y="0"/>
-                      <a:ext cx="7362825" cy="11039475"/>
+                      <a:ext cx="7429500" cy="10477500"/>
                     </a:xfrm>
                     <a:prstGeom prst="rect">
                       <a:avLst/>

</xml_diff>